<commit_message>
docs: update handoff + PRD to reflect FREQUENCY v0.1 complete; add dev handoff doc
</commit_message>
<xml_diff>
--- a/FREQUENCY_PRD_v01.docx
+++ b/FREQUENCY_PRD_v01.docx
@@ -383,7 +383,7 @@
                 <w:sz w:val="22"/>
                 <w:szCs w:val="22"/>
               </w:rPr>
-              <w:t xml:space="preserve">Draft — pending founder review</w:t>
+              <w:t xml:space="preserve">✅ COMPLETE — built and committed to GitHub 2026-03-03</w:t>
             </w:r>
           </w:p>
         </w:tc>
@@ -1255,7 +1255,7 @@
           <w:sz w:val="22"/>
           <w:szCs w:val="22"/>
         </w:rPr>
-        <w:t xml:space="preserve">☐  </w:t>
+        <w:t xml:space="preserve">☑  </w:t>
       </w:r>
       <w:r>
         <w:rPr>
@@ -1278,7 +1278,7 @@
           <w:sz w:val="22"/>
           <w:szCs w:val="22"/>
         </w:rPr>
-        <w:t xml:space="preserve">☐  </w:t>
+        <w:t xml:space="preserve">☑  </w:t>
       </w:r>
       <w:r>
         <w:rPr>
@@ -1301,7 +1301,7 @@
           <w:sz w:val="22"/>
           <w:szCs w:val="22"/>
         </w:rPr>
-        <w:t xml:space="preserve">☐  </w:t>
+        <w:t xml:space="preserve">☑  </w:t>
       </w:r>
       <w:r>
         <w:rPr>
@@ -1324,7 +1324,7 @@
           <w:sz w:val="22"/>
           <w:szCs w:val="22"/>
         </w:rPr>
-        <w:t xml:space="preserve">☐  </w:t>
+        <w:t xml:space="preserve">☑  </w:t>
       </w:r>
       <w:r>
         <w:rPr>
@@ -1347,7 +1347,7 @@
           <w:sz w:val="22"/>
           <w:szCs w:val="22"/>
         </w:rPr>
-        <w:t xml:space="preserve">☐  </w:t>
+        <w:t xml:space="preserve">☑  </w:t>
       </w:r>
       <w:r>
         <w:rPr>
@@ -1370,7 +1370,7 @@
           <w:sz w:val="22"/>
           <w:szCs w:val="22"/>
         </w:rPr>
-        <w:t xml:space="preserve">☐  </w:t>
+        <w:t xml:space="preserve">☑  </w:t>
       </w:r>
       <w:r>
         <w:rPr>
@@ -3639,7 +3639,7 @@
           <w:sz w:val="22"/>
           <w:szCs w:val="22"/>
         </w:rPr>
-        <w:t xml:space="preserve">☐  </w:t>
+        <w:t xml:space="preserve">☑  </w:t>
       </w:r>
       <w:r>
         <w:rPr>
@@ -3662,7 +3662,7 @@
           <w:sz w:val="22"/>
           <w:szCs w:val="22"/>
         </w:rPr>
-        <w:t xml:space="preserve">☐  </w:t>
+        <w:t xml:space="preserve">☑  </w:t>
       </w:r>
       <w:r>
         <w:rPr>
@@ -3685,7 +3685,7 @@
           <w:sz w:val="22"/>
           <w:szCs w:val="22"/>
         </w:rPr>
-        <w:t xml:space="preserve">☐  </w:t>
+        <w:t xml:space="preserve">☑  </w:t>
       </w:r>
       <w:r>
         <w:rPr>
@@ -3708,7 +3708,7 @@
           <w:sz w:val="22"/>
           <w:szCs w:val="22"/>
         </w:rPr>
-        <w:t xml:space="preserve">☐  </w:t>
+        <w:t xml:space="preserve">☑  </w:t>
       </w:r>
       <w:r>
         <w:rPr>
@@ -3731,7 +3731,7 @@
           <w:sz w:val="22"/>
           <w:szCs w:val="22"/>
         </w:rPr>
-        <w:t xml:space="preserve">☐  </w:t>
+        <w:t xml:space="preserve">☑  </w:t>
       </w:r>
       <w:r>
         <w:rPr>
@@ -3754,7 +3754,7 @@
           <w:sz w:val="22"/>
           <w:szCs w:val="22"/>
         </w:rPr>
-        <w:t xml:space="preserve">☐  </w:t>
+        <w:t xml:space="preserve">☑  </w:t>
       </w:r>
       <w:r>
         <w:rPr>
@@ -3777,7 +3777,7 @@
           <w:sz w:val="22"/>
           <w:szCs w:val="22"/>
         </w:rPr>
-        <w:t xml:space="preserve">☐  </w:t>
+        <w:t xml:space="preserve">☑  </w:t>
       </w:r>
       <w:r>
         <w:rPr>
@@ -3800,7 +3800,7 @@
           <w:sz w:val="22"/>
           <w:szCs w:val="22"/>
         </w:rPr>
-        <w:t xml:space="preserve">☐  </w:t>
+        <w:t xml:space="preserve">☑  </w:t>
       </w:r>
       <w:r>
         <w:rPr>
@@ -3853,7 +3853,7 @@
           <w:sz w:val="22"/>
           <w:szCs w:val="22"/>
         </w:rPr>
-        <w:t xml:space="preserve">☐  </w:t>
+        <w:t xml:space="preserve">☑  </w:t>
       </w:r>
       <w:r>
         <w:rPr>
@@ -3876,7 +3876,7 @@
           <w:sz w:val="22"/>
           <w:szCs w:val="22"/>
         </w:rPr>
-        <w:t xml:space="preserve">☐  </w:t>
+        <w:t xml:space="preserve">☑  </w:t>
       </w:r>
       <w:r>
         <w:rPr>
@@ -3899,7 +3899,7 @@
           <w:sz w:val="22"/>
           <w:szCs w:val="22"/>
         </w:rPr>
-        <w:t xml:space="preserve">☐  </w:t>
+        <w:t xml:space="preserve">☑  </w:t>
       </w:r>
       <w:r>
         <w:rPr>
@@ -6621,7 +6621,7 @@
                 <w:sz w:val="22"/>
                 <w:szCs w:val="22"/>
               </w:rPr>
-              <w:t xml:space="preserve">Deck shuffle: per-encounter (single shuffle at start) or per-turn (reshuffle when empty)? Per-encounter increases planning depth; per-turn increases variety.</w:t>
+              <w:t xml:space="preserve">✅ RESOLVED: Per-turn reshuffle when empty. Implemented in CardSystem.js — deck reshuffles from discard pile when draw pile is empty. Provides variety without losing all planning depth.</w:t>
             </w:r>
           </w:p>
         </w:tc>
@@ -6716,7 +6716,7 @@
                 <w:sz w:val="22"/>
                 <w:szCs w:val="22"/>
               </w:rPr>
-              <w:t xml:space="preserve">AP carryover: should unspent AP carry to next turn? Increases tactical ceiling but adds complexity. Recommend: no carryover for v0.1.</w:t>
+              <w:t xml:space="preserve">✅ RESOLVED: No carryover. AP resets to 3 each turn. Confirmed in BattleManager.js — AP_PER_TURN = 3, reset on DRAW phase.</w:t>
             </w:r>
           </w:p>
         </w:tc>
@@ -6906,7 +6906,7 @@
                 <w:sz w:val="22"/>
                 <w:szCs w:val="22"/>
               </w:rPr>
-              <w:t xml:space="preserve">Are character portrait PNGs usable as in-game battle sprites or do we need separate sprite crops? Recommend: use portraits as-is with CSS clip.</w:t>
+              <w:t xml:space="preserve">✅ RESOLVED: Separate assets generated. ash-sprite.png + vera-sprite.png for battle, ash-portrait.png + vera-portrait.png for character slots. All four in game/public/assets/characters/.</w:t>
             </w:r>
           </w:p>
         </w:tc>
@@ -7001,7 +7001,7 @@
                 <w:sz w:val="22"/>
                 <w:szCs w:val="22"/>
               </w:rPr>
-              <w:t xml:space="preserve">What flavor text goes on the Stage Select screen? (Mission name + 2-line brief)</w:t>
+              <w:t xml:space="preserve">✅ RESOLVED: Chapter 01 “Meridian Contact” — mission briefing implemented in StageSelect.js with party preview, enemy intel card, and Begin Mission CTA.</w:t>
             </w:r>
           </w:p>
         </w:tc>
@@ -7174,7 +7174,7 @@
                 <w:sz w:val="22"/>
                 <w:szCs w:val="22"/>
               </w:rPr>
-              <w:t xml:space="preserve">PRD finalized</w:t>
+              <w:t xml:space="preserve">✅ PRD finalized</w:t>
             </w:r>
           </w:p>
         </w:tc>
@@ -7205,7 +7205,7 @@
                 <w:sz w:val="22"/>
                 <w:szCs w:val="22"/>
               </w:rPr>
-              <w:t xml:space="preserve">2026-03-03 (today)</w:t>
+              <w:t xml:space="preserve">✅ 2026-03-03 — COMPLETE</w:t>
             </w:r>
           </w:p>
         </w:tc>
@@ -7238,7 +7238,7 @@
                 <w:sz w:val="22"/>
                 <w:szCs w:val="22"/>
               </w:rPr>
-              <w:t xml:space="preserve">CharacterData + BattleManager + CardSystem</w:t>
+              <w:t xml:space="preserve">✅ CharacterData + BattleManager + CardSystem</w:t>
             </w:r>
           </w:p>
         </w:tc>
@@ -7302,7 +7302,7 @@
                 <w:sz w:val="22"/>
                 <w:szCs w:val="22"/>
               </w:rPr>
-              <w:t xml:space="preserve">UI components + BattleScene wired up</w:t>
+              <w:t xml:space="preserve">✅ UI components + BattleScene wired up</w:t>
             </w:r>
           </w:p>
         </w:tc>
@@ -7366,7 +7366,7 @@
                 <w:sz w:val="22"/>
                 <w:szCs w:val="22"/>
               </w:rPr>
-              <w:t xml:space="preserve">StageSelect + ResultScreen + full flow</w:t>
+              <w:t xml:space="preserve">✅ StageSelect + ResultScreen + full flow</w:t>
             </w:r>
           </w:p>
         </w:tc>
@@ -7430,7 +7430,7 @@
                 <w:sz w:val="22"/>
                 <w:szCs w:val="22"/>
               </w:rPr>
-              <w:t xml:space="preserve">Internal smoke test (all P0 AC pass)</w:t>
+              <w:t xml:space="preserve">⬜ Internal smoke test (all P0 AC pass)</w:t>
             </w:r>
           </w:p>
         </w:tc>
@@ -7461,7 +7461,7 @@
                 <w:sz w:val="22"/>
                 <w:szCs w:val="22"/>
               </w:rPr>
-              <w:t xml:space="preserve">After Session 2</w:t>
+              <w:t xml:space="preserve">2026-03-03 — run npm run dev to begin</w:t>
             </w:r>
           </w:p>
         </w:tc>
@@ -7494,7 +7494,7 @@
                 <w:sz w:val="22"/>
                 <w:szCs w:val="22"/>
               </w:rPr>
-              <w:t xml:space="preserve">First external playtester URL shared</w:t>
+              <w:t xml:space="preserve">⬜ First external playtester URL shared</w:t>
             </w:r>
           </w:p>
         </w:tc>
@@ -7525,7 +7525,7 @@
                 <w:sz w:val="22"/>
                 <w:szCs w:val="22"/>
               </w:rPr>
-              <w:t xml:space="preserve">After smoke test</w:t>
+              <w:t xml:space="preserve">After smoke test — TBD</w:t>
             </w:r>
           </w:p>
         </w:tc>

</xml_diff>